<commit_message>
attempt to update to end 2025
</commit_message>
<xml_diff>
--- a/Research on Minimum Wage in Dominican Republic.docx
+++ b/Research on Minimum Wage in Dominican Republic.docx
@@ -56,6 +56,25 @@
       </w:r>
     </w:p>
     <w:p>
+      <w:r>
+        <w:rPr>
+          <w:b/>
+          <w:bCs/>
+        </w:rPr>
+        <w:t>Preferred Response Style</w:t>
+      </w:r>
+      <w:r>
+        <w:rPr>
+          <w:b/>
+          <w:bCs/>
+        </w:rPr>
+        <w:t xml:space="preserve">: </w:t>
+      </w:r>
+      <w:r>
+        <w:t>Please be critical and do not shy away from telling me I am wrong. This is for a research project so precision of logic and clean documentation of decisions is important. Prioritize simplicity and efficiency in code and avoid over engineering and considering too many unlikely edge cases. This is not production level code is a project designed to carry out a specific scoped analysis.</w:t>
+      </w:r>
+    </w:p>
+    <w:p>
       <w:pPr>
         <w:rPr>
           <w:b/>
@@ -221,6 +240,7 @@
           <w:b/>
           <w:bCs/>
         </w:rPr>
+        <w:lastRenderedPageBreak/>
         <w:t>Minimum Wage Events</w:t>
       </w:r>
       <w:r>
@@ -255,140 +275,143 @@
           <w:b/>
           <w:bCs/>
         </w:rPr>
+        <w:t xml:space="preserve">Firm </w:t>
+      </w:r>
+      <w:r>
+        <w:rPr>
+          <w:b/>
+          <w:bCs/>
+        </w:rPr>
+        <w:t>S</w:t>
+      </w:r>
+      <w:r>
+        <w:rPr>
+          <w:b/>
+          <w:bCs/>
+        </w:rPr>
+        <w:t>ize</w:t>
+      </w:r>
+      <w:r>
+        <w:rPr>
+          <w:b/>
+          <w:bCs/>
+        </w:rPr>
+        <w:t xml:space="preserve"> Determination</w:t>
+      </w:r>
+      <w:r>
+        <w:rPr>
+          <w:b/>
+          <w:bCs/>
+        </w:rPr>
+        <w:t>:</w:t>
+      </w:r>
+      <w:r>
+        <w:t xml:space="preserve"> In the survey workers are asked their firm size. This is worker recollection and may not be accurate. In addition, the responses can be 1-10, 11-20, 20-30, 31-50, 51-99, 100+ and don’t know (bin coded). For those less than 10 workers there is a follow up question to get an integer number instead of a bin. We map these to the legal categories as best we can.</w:t>
+      </w:r>
+    </w:p>
+    <w:p>
+      <w:r>
+        <w:t>The key issue here is that medium firms legally are 50-150 but the survey response bins are 50-100 and 100+. This means we cannot fully capture medium firms. We have decided to code 100+ as large but this means when comparing the minimum wage (especially for compliance) there is an issue where some firms coded as large may be non-compliant at that wage but compliant if we could identify them as medium and apply the lower minimum wage.</w:t>
+      </w:r>
+    </w:p>
+    <w:p>
+      <w:r>
+        <w:rPr>
+          <w:b/>
+          <w:bCs/>
+        </w:rPr>
+        <w:t>Firm Size Distribution:</w:t>
+      </w:r>
+      <w:r>
+        <w:t xml:space="preserve"> In Dominican Republic most </w:t>
+      </w:r>
+      <w:r>
+        <w:t xml:space="preserve">firms are large firms, but most </w:t>
+      </w:r>
+      <w:r>
+        <w:t>workers are employed by</w:t>
+      </w:r>
+      <w:r>
+        <w:t xml:space="preserve"> </w:t>
+      </w:r>
+      <w:r>
+        <w:t>small or micro size</w:t>
+      </w:r>
+      <w:r>
+        <w:t xml:space="preserve"> firms</w:t>
+      </w:r>
+      <w:r>
+        <w:t xml:space="preserve">. There are very few </w:t>
+      </w:r>
+      <w:r>
+        <w:t xml:space="preserve">workers in our data who report working with </w:t>
+      </w:r>
+      <w:r>
+        <w:t xml:space="preserve">medium </w:t>
+      </w:r>
+      <w:r>
+        <w:t>size firms. This is partly due to the survey issue discussed above but is also generally true as confirmed through other administrative datasets.</w:t>
+      </w:r>
+    </w:p>
+    <w:p/>
+    <w:p>
+      <w:r>
+        <w:rPr>
+          <w:b/>
+          <w:bCs/>
+        </w:rPr>
+        <w:t>Methodology:</w:t>
+      </w:r>
+      <w:r>
+        <w:rPr>
+          <w:b/>
+          <w:bCs/>
+        </w:rPr>
+        <w:t xml:space="preserve"> </w:t>
+      </w:r>
+      <w:r>
+        <w:t xml:space="preserve">We are </w:t>
+      </w:r>
+      <w:r>
+        <w:t>currently exploring 2 methodologies which could be used in a complimentary way or as robustness</w:t>
+      </w:r>
+      <w:r>
+        <w:t xml:space="preserve"> since they address the issue differently/allow different time periods of analysis.</w:t>
+      </w:r>
+    </w:p>
+    <w:p>
+      <w:r>
+        <w:t>Method 1: Follow closely the Parente paper using initial exposure differences to the minimum wage by provinces to estimate the impact of minimum wage changes on inequality and informality. We would construct our exposure to be a weighted average to include the firm size distribution in a province as weights so that we can still incorporate that dimension.</w:t>
+      </w:r>
+      <w:r>
+        <w:t xml:space="preserve"> The base would be 2016 annual average because we want to treat the 2015Q2 event as included in the baseline. </w:t>
+      </w:r>
+      <w:r>
+        <w:t xml:space="preserve">We are also considering </w:t>
+      </w:r>
+      <w:r>
+        <w:t xml:space="preserve">how to implement </w:t>
+      </w:r>
+      <w:r>
+        <w:t>a stacked events design given that, unlike Parente, we have multiple events in our sample period</w:t>
+      </w:r>
+      <w:r>
+        <w:t>.</w:t>
+      </w:r>
+    </w:p>
+    <w:p>
+      <w:pPr>
+        <w:rPr>
+          <w:b/>
+          <w:bCs/>
+        </w:rPr>
+      </w:pPr>
+      <w:r>
+        <w:t xml:space="preserve">Method 2: The 2021Q3 event is unique because the authorities created a new “micro” minimum wage category with a lower min wage. Before this firms with less than 10 workers were covered under small and suddenly, they got a new minimum wage. The ENCFT has a </w:t>
+      </w:r>
+      <w:r>
         <w:lastRenderedPageBreak/>
-        <w:t xml:space="preserve">Firm </w:t>
-      </w:r>
-      <w:r>
-        <w:rPr>
-          <w:b/>
-          <w:bCs/>
-        </w:rPr>
-        <w:t>S</w:t>
-      </w:r>
-      <w:r>
-        <w:rPr>
-          <w:b/>
-          <w:bCs/>
-        </w:rPr>
-        <w:t>ize</w:t>
-      </w:r>
-      <w:r>
-        <w:rPr>
-          <w:b/>
-          <w:bCs/>
-        </w:rPr>
-        <w:t xml:space="preserve"> Determination</w:t>
-      </w:r>
-      <w:r>
-        <w:rPr>
-          <w:b/>
-          <w:bCs/>
-        </w:rPr>
-        <w:t>:</w:t>
-      </w:r>
-      <w:r>
-        <w:t xml:space="preserve"> In the survey workers are asked their firm size. This is worker recollection and may not be accurate. In addition, the responses can be 1-10, 11-20, 20-30, 31-50, 51-99, 100+ and don’t know (bin coded). For those less than 10 workers there is a follow up question to get an integer number instead of a bin. We map these to the legal categories as best we can.</w:t>
-      </w:r>
-    </w:p>
-    <w:p>
-      <w:r>
-        <w:t>The key issue here is that medium firms legally are 50-150 but the survey response bins are 50-100 and 100+. This means we cannot fully capture medium firms. We have decided to code 100+ as large but this means when comparing the minimum wage (especially for compliance) there is an issue where some firms coded as large may be non-compliant at that wage but compliant if we could identify them as medium and apply the lower minimum wage.</w:t>
-      </w:r>
-    </w:p>
-    <w:p>
-      <w:r>
-        <w:rPr>
-          <w:b/>
-          <w:bCs/>
-        </w:rPr>
-        <w:t>Firm Size Distribution:</w:t>
-      </w:r>
-      <w:r>
-        <w:t xml:space="preserve"> In Dominican Republic most </w:t>
-      </w:r>
-      <w:r>
-        <w:t xml:space="preserve">firms are large firms, but most </w:t>
-      </w:r>
-      <w:r>
-        <w:t>workers are employed by</w:t>
-      </w:r>
-      <w:r>
-        <w:t xml:space="preserve"> </w:t>
-      </w:r>
-      <w:r>
-        <w:t>small or micro size</w:t>
-      </w:r>
-      <w:r>
-        <w:t xml:space="preserve"> firms</w:t>
-      </w:r>
-      <w:r>
-        <w:t xml:space="preserve">. There are very few </w:t>
-      </w:r>
-      <w:r>
-        <w:t xml:space="preserve">workers in our data who report working with </w:t>
-      </w:r>
-      <w:r>
-        <w:t xml:space="preserve">medium </w:t>
-      </w:r>
-      <w:r>
-        <w:t>size firms. This is partly due to the survey issue discussed above but is also generally true as confirmed through other administrative datasets.</w:t>
-      </w:r>
-    </w:p>
-    <w:p/>
-    <w:p>
-      <w:r>
-        <w:rPr>
-          <w:b/>
-          <w:bCs/>
-        </w:rPr>
-        <w:t>Methodology:</w:t>
-      </w:r>
-      <w:r>
-        <w:rPr>
-          <w:b/>
-          <w:bCs/>
-        </w:rPr>
-        <w:t xml:space="preserve"> </w:t>
-      </w:r>
-      <w:r>
-        <w:t xml:space="preserve">We are </w:t>
-      </w:r>
-      <w:r>
-        <w:t>currently exploring 2 methodologies which could be used in a complimentary way or as robustness</w:t>
-      </w:r>
-      <w:r>
-        <w:t xml:space="preserve"> since they address the issue differently/allow different time periods of analysis.</w:t>
-      </w:r>
-    </w:p>
-    <w:p>
-      <w:r>
-        <w:t>Method 1: Follow closely the Parente paper using initial exposure differences to the minimum wage by provinces to estimate the impact of minimum wage changes on inequality and informality. We would construct our exposure to be a weighted average to include the firm size distribution in a province as weights so that we can still incorporate that dimension.</w:t>
-      </w:r>
-      <w:r>
-        <w:t xml:space="preserve"> The base would be 2016 annual average because we want to treat the 2015Q2 event as included in the baseline. </w:t>
-      </w:r>
-      <w:r>
-        <w:t xml:space="preserve">We are also considering </w:t>
-      </w:r>
-      <w:r>
-        <w:t xml:space="preserve">how to implement </w:t>
-      </w:r>
-      <w:r>
-        <w:t>a stacked events design given that, unlike Parente, we have multiple events in our sample period</w:t>
-      </w:r>
-      <w:r>
-        <w:t>.</w:t>
-      </w:r>
-    </w:p>
-    <w:p>
-      <w:pPr>
-        <w:rPr>
-          <w:b/>
-          <w:bCs/>
-        </w:rPr>
-      </w:pPr>
-      <w:r>
-        <w:t>Method 2: The 2021Q3 event is unique because the authorities created a new “micro” minimum wage category with a lower min wage. Before this firms with less than 10 workers were covered under small and suddenly, they got a new minimum wage. The ENCFT has a rotating household panel structure which would allow us to follow the same households up to 5 quarters giving us a potential of up to 2 quarters before and after the 2021Q3 event to exploit for a difference in difference estimate</w:t>
+        <w:t>rotating household panel structure which would allow us to follow the same households up to 5 quarters giving us a potential of up to 2 quarters before and after the 2021Q3 event to exploit for a difference in difference estimate</w:t>
       </w:r>
       <w:r>
         <w:t xml:space="preserve"> on the same individuals. This would potentially be a better estimate but limit the analysis of outcomes significantly given the tight time period and not allow for assessment of cumulative wage increases over time.</w:t>
@@ -622,6 +645,7 @@
         </w:numPr>
       </w:pPr>
       <w:r>
+        <w:lastRenderedPageBreak/>
         <w:t>Code in R using tidy verse style</w:t>
       </w:r>
     </w:p>
@@ -690,7 +714,6 @@
     </w:p>
     <w:p>
       <w:r>
-        <w:lastRenderedPageBreak/>
         <w:t>Project Variable codebook</w:t>
       </w:r>
       <w:r>
@@ -1025,6 +1048,7 @@
           <w:b/>
           <w:bCs/>
         </w:rPr>
+        <w:lastRenderedPageBreak/>
         <w:t>04</w:t>
       </w:r>
       <w:r>
@@ -1068,7 +1092,6 @@
           <w:b/>
           <w:bCs/>
         </w:rPr>
-        <w:lastRenderedPageBreak/>
         <w:t>0</w:t>
       </w:r>
       <w:r>

</xml_diff>